<commit_message>
update BI dan draft proposal thesis
</commit_message>
<xml_diff>
--- a/Adi Cahyono - 250605210001.docx
+++ b/Adi Cahyono - 250605210001.docx
@@ -5296,17 +5296,119 @@
           <w:szCs w:val="24"/>
           <w:lang w:val="en-US"/>
         </w:rPr>
-        <w:t>Bagaimana perbandingan tingkat akurasi antara model Long Short-Term Memory (LSTM) dan Gated Recurrent Unit (GRU) dalam memprediksi harga penutupan saham pada lima emiten</w:t>
-      </w:r>
-      <w:r>
-        <w:rPr>
-          <w:rFonts w:ascii="Times New Roman" w:hAnsi="Times New Roman" w:cs="Times New Roman"/>
-          <w:sz w:val="24"/>
-          <w:szCs w:val="24"/>
-          <w:lang w:val="en-US"/>
-        </w:rPr>
-        <w:t xml:space="preserve"> ?</w:t>
-      </w:r>
+        <w:t xml:space="preserve">Bagaimana </w:t>
+      </w:r>
+      <w:proofErr w:type="spellStart"/>
+      <w:r>
+        <w:rPr>
+          <w:rFonts w:ascii="Times New Roman" w:hAnsi="Times New Roman" w:cs="Times New Roman"/>
+          <w:sz w:val="24"/>
+          <w:szCs w:val="24"/>
+          <w:lang w:val="en-US"/>
+        </w:rPr>
+        <w:t>tingkat</w:t>
+      </w:r>
+      <w:proofErr w:type="spellEnd"/>
+      <w:r>
+        <w:rPr>
+          <w:rFonts w:ascii="Times New Roman" w:hAnsi="Times New Roman" w:cs="Times New Roman"/>
+          <w:sz w:val="24"/>
+          <w:szCs w:val="24"/>
+          <w:lang w:val="en-US"/>
+        </w:rPr>
+        <w:t xml:space="preserve"> akurasi antara model </w:t>
+      </w:r>
+      <w:r>
+        <w:rPr>
+          <w:rFonts w:ascii="Times New Roman" w:hAnsi="Times New Roman" w:cs="Times New Roman"/>
+          <w:i/>
+          <w:iCs/>
+          <w:sz w:val="24"/>
+          <w:szCs w:val="24"/>
+          <w:lang w:val="en-US"/>
+        </w:rPr>
+        <w:t>Long Short-Term Memory</w:t>
+      </w:r>
+      <w:r>
+        <w:rPr>
+          <w:rFonts w:ascii="Times New Roman" w:hAnsi="Times New Roman" w:cs="Times New Roman"/>
+          <w:sz w:val="24"/>
+          <w:szCs w:val="24"/>
+          <w:lang w:val="en-US"/>
+        </w:rPr>
+        <w:t xml:space="preserve"> (LSTM) dan </w:t>
+      </w:r>
+      <w:r>
+        <w:rPr>
+          <w:rFonts w:ascii="Times New Roman" w:hAnsi="Times New Roman" w:cs="Times New Roman"/>
+          <w:i/>
+          <w:iCs/>
+          <w:sz w:val="24"/>
+          <w:szCs w:val="24"/>
+          <w:lang w:val="en-US"/>
+        </w:rPr>
+        <w:t>Gated Recurrent Unit</w:t>
+      </w:r>
+      <w:r>
+        <w:rPr>
+          <w:rFonts w:ascii="Times New Roman" w:hAnsi="Times New Roman" w:cs="Times New Roman"/>
+          <w:sz w:val="24"/>
+          <w:szCs w:val="24"/>
+          <w:lang w:val="en-US"/>
+        </w:rPr>
+        <w:t xml:space="preserve"> (GRU) dalam memprediksi harga penutupan saham pada lima </w:t>
+      </w:r>
+      <w:proofErr w:type="spellStart"/>
+      <w:r>
+        <w:rPr>
+          <w:rFonts w:ascii="Times New Roman" w:hAnsi="Times New Roman" w:cs="Times New Roman"/>
+          <w:sz w:val="24"/>
+          <w:szCs w:val="24"/>
+          <w:lang w:val="en-US"/>
+        </w:rPr>
+        <w:t>emiten</w:t>
+      </w:r>
+      <w:proofErr w:type="spellEnd"/>
+      <w:r>
+        <w:rPr>
+          <w:rFonts w:ascii="Times New Roman" w:hAnsi="Times New Roman" w:cs="Times New Roman"/>
+          <w:sz w:val="24"/>
+          <w:szCs w:val="24"/>
+          <w:lang w:val="en-US"/>
+        </w:rPr>
+        <w:t xml:space="preserve"> </w:t>
+      </w:r>
+      <w:proofErr w:type="spellStart"/>
+      <w:proofErr w:type="gramStart"/>
+      <w:r>
+        <w:rPr>
+          <w:rFonts w:ascii="Times New Roman" w:hAnsi="Times New Roman" w:cs="Times New Roman"/>
+          <w:sz w:val="24"/>
+          <w:szCs w:val="24"/>
+          <w:lang w:val="en-US"/>
+        </w:rPr>
+        <w:t>perbankan</w:t>
+      </w:r>
+      <w:proofErr w:type="spellEnd"/>
+      <w:r>
+        <w:rPr>
+          <w:rFonts w:ascii="Times New Roman" w:hAnsi="Times New Roman" w:cs="Times New Roman"/>
+          <w:sz w:val="24"/>
+          <w:szCs w:val="24"/>
+          <w:lang w:val="en-US"/>
+        </w:rPr>
+        <w:t xml:space="preserve"> </w:t>
+      </w:r>
+      <w:r>
+        <w:rPr>
+          <w:rFonts w:ascii="Times New Roman" w:hAnsi="Times New Roman" w:cs="Times New Roman"/>
+          <w:sz w:val="24"/>
+          <w:szCs w:val="24"/>
+          <w:lang w:val="en-US"/>
+        </w:rPr>
+        <w:t>?</w:t>
+      </w:r>
+      <w:proofErr w:type="gramEnd"/>
     </w:p>
     <w:p>
       <w:pPr>
@@ -5326,14 +5428,74 @@
           <w:lang w:val="en-US"/>
         </w:rPr>
       </w:pPr>
-      <w:r>
-        <w:rPr>
-          <w:rFonts w:ascii="Times New Roman" w:hAnsi="Times New Roman" w:cs="Times New Roman"/>
-          <w:sz w:val="24"/>
-          <w:szCs w:val="24"/>
-          <w:lang w:val="en-US"/>
-        </w:rPr>
-        <w:t xml:space="preserve">Model deep learning manakah yang menunjukan kinerja prediksi yang stabil, konsisten dan efisien ketika diterapkan pada data </w:t>
+      <w:proofErr w:type="spellStart"/>
+      <w:r>
+        <w:rPr>
+          <w:rFonts w:ascii="Times New Roman" w:hAnsi="Times New Roman" w:cs="Times New Roman"/>
+          <w:sz w:val="24"/>
+          <w:szCs w:val="24"/>
+          <w:lang w:val="en-US"/>
+        </w:rPr>
+        <w:t>Bagaimana</w:t>
+      </w:r>
+      <w:proofErr w:type="spellEnd"/>
+      <w:r>
+        <w:rPr>
+          <w:rFonts w:ascii="Times New Roman" w:hAnsi="Times New Roman" w:cs="Times New Roman"/>
+          <w:sz w:val="24"/>
+          <w:szCs w:val="24"/>
+          <w:lang w:val="en-US"/>
+        </w:rPr>
+        <w:t xml:space="preserve"> </w:t>
+      </w:r>
+      <w:proofErr w:type="spellStart"/>
+      <w:r>
+        <w:rPr>
+          <w:rFonts w:ascii="Times New Roman" w:hAnsi="Times New Roman" w:cs="Times New Roman"/>
+          <w:sz w:val="24"/>
+          <w:szCs w:val="24"/>
+          <w:lang w:val="en-US"/>
+        </w:rPr>
+        <w:t>karakteristik</w:t>
+      </w:r>
+      <w:proofErr w:type="spellEnd"/>
+      <w:r>
+        <w:rPr>
+          <w:rFonts w:ascii="Times New Roman" w:hAnsi="Times New Roman" w:cs="Times New Roman"/>
+          <w:sz w:val="24"/>
+          <w:szCs w:val="24"/>
+          <w:lang w:val="en-US"/>
+        </w:rPr>
+        <w:t xml:space="preserve"> </w:t>
+      </w:r>
+      <w:proofErr w:type="spellStart"/>
+      <w:r>
+        <w:rPr>
+          <w:rFonts w:ascii="Times New Roman" w:hAnsi="Times New Roman" w:cs="Times New Roman"/>
+          <w:sz w:val="24"/>
+          <w:szCs w:val="24"/>
+          <w:lang w:val="en-US"/>
+        </w:rPr>
+        <w:t>kinerja</w:t>
+      </w:r>
+      <w:proofErr w:type="spellEnd"/>
+      <w:r>
+        <w:rPr>
+          <w:rFonts w:ascii="Times New Roman" w:hAnsi="Times New Roman" w:cs="Times New Roman"/>
+          <w:sz w:val="24"/>
+          <w:szCs w:val="24"/>
+          <w:lang w:val="en-US"/>
+        </w:rPr>
+        <w:t xml:space="preserve"> </w:t>
+      </w:r>
+      <w:r>
+        <w:rPr>
+          <w:rFonts w:ascii="Times New Roman" w:hAnsi="Times New Roman" w:cs="Times New Roman"/>
+          <w:sz w:val="24"/>
+          <w:szCs w:val="24"/>
+          <w:lang w:val="en-US"/>
+        </w:rPr>
+        <w:t xml:space="preserve">model </w:t>
       </w:r>
       <w:r>
         <w:rPr>
@@ -5344,6 +5506,135 @@
           <w:szCs w:val="24"/>
           <w:lang w:val="en-US"/>
         </w:rPr>
+        <w:t>deep learning</w:t>
+      </w:r>
+      <w:r>
+        <w:rPr>
+          <w:rFonts w:ascii="Times New Roman" w:hAnsi="Times New Roman" w:cs="Times New Roman"/>
+          <w:sz w:val="24"/>
+          <w:szCs w:val="24"/>
+          <w:lang w:val="en-US"/>
+        </w:rPr>
+        <w:t xml:space="preserve"> </w:t>
+      </w:r>
+      <w:r>
+        <w:rPr>
+          <w:rFonts w:ascii="Times New Roman" w:hAnsi="Times New Roman" w:cs="Times New Roman"/>
+          <w:sz w:val="24"/>
+          <w:szCs w:val="24"/>
+          <w:lang w:val="en-US"/>
+        </w:rPr>
+        <w:t xml:space="preserve">dalam </w:t>
+      </w:r>
+      <w:proofErr w:type="spellStart"/>
+      <w:r>
+        <w:rPr>
+          <w:rFonts w:ascii="Times New Roman" w:hAnsi="Times New Roman" w:cs="Times New Roman"/>
+          <w:sz w:val="24"/>
+          <w:szCs w:val="24"/>
+          <w:lang w:val="en-US"/>
+        </w:rPr>
+        <w:t>menghasilkan</w:t>
+      </w:r>
+      <w:proofErr w:type="spellEnd"/>
+      <w:r>
+        <w:rPr>
+          <w:rFonts w:ascii="Times New Roman" w:hAnsi="Times New Roman" w:cs="Times New Roman"/>
+          <w:sz w:val="24"/>
+          <w:szCs w:val="24"/>
+          <w:lang w:val="en-US"/>
+        </w:rPr>
+        <w:t xml:space="preserve"> </w:t>
+      </w:r>
+      <w:proofErr w:type="spellStart"/>
+      <w:r>
+        <w:rPr>
+          <w:rFonts w:ascii="Times New Roman" w:hAnsi="Times New Roman" w:cs="Times New Roman"/>
+          <w:sz w:val="24"/>
+          <w:szCs w:val="24"/>
+          <w:lang w:val="en-US"/>
+        </w:rPr>
+        <w:t>prediksi</w:t>
+      </w:r>
+      <w:proofErr w:type="spellEnd"/>
+      <w:r>
+        <w:rPr>
+          <w:rFonts w:ascii="Times New Roman" w:hAnsi="Times New Roman" w:cs="Times New Roman"/>
+          <w:sz w:val="24"/>
+          <w:szCs w:val="24"/>
+          <w:lang w:val="en-US"/>
+        </w:rPr>
+        <w:t xml:space="preserve"> yang </w:t>
+      </w:r>
+      <w:proofErr w:type="spellStart"/>
+      <w:r>
+        <w:rPr>
+          <w:rFonts w:ascii="Times New Roman" w:hAnsi="Times New Roman" w:cs="Times New Roman"/>
+          <w:sz w:val="24"/>
+          <w:szCs w:val="24"/>
+          <w:lang w:val="en-US"/>
+        </w:rPr>
+        <w:t>stabil</w:t>
+      </w:r>
+      <w:proofErr w:type="spellEnd"/>
+      <w:r>
+        <w:rPr>
+          <w:rFonts w:ascii="Times New Roman" w:hAnsi="Times New Roman" w:cs="Times New Roman"/>
+          <w:sz w:val="24"/>
+          <w:szCs w:val="24"/>
+          <w:lang w:val="en-US"/>
+        </w:rPr>
+        <w:t xml:space="preserve">, </w:t>
+      </w:r>
+      <w:proofErr w:type="spellStart"/>
+      <w:r>
+        <w:rPr>
+          <w:rFonts w:ascii="Times New Roman" w:hAnsi="Times New Roman" w:cs="Times New Roman"/>
+          <w:sz w:val="24"/>
+          <w:szCs w:val="24"/>
+          <w:lang w:val="en-US"/>
+        </w:rPr>
+        <w:t>konsisten</w:t>
+      </w:r>
+      <w:proofErr w:type="spellEnd"/>
+      <w:r>
+        <w:rPr>
+          <w:rFonts w:ascii="Times New Roman" w:hAnsi="Times New Roman" w:cs="Times New Roman"/>
+          <w:sz w:val="24"/>
+          <w:szCs w:val="24"/>
+          <w:lang w:val="en-US"/>
+        </w:rPr>
+        <w:t xml:space="preserve">, dan </w:t>
+      </w:r>
+      <w:proofErr w:type="spellStart"/>
+      <w:r>
+        <w:rPr>
+          <w:rFonts w:ascii="Times New Roman" w:hAnsi="Times New Roman" w:cs="Times New Roman"/>
+          <w:sz w:val="24"/>
+          <w:szCs w:val="24"/>
+          <w:lang w:val="en-US"/>
+        </w:rPr>
+        <w:t>efisien</w:t>
+      </w:r>
+      <w:proofErr w:type="spellEnd"/>
+      <w:r>
+        <w:rPr>
+          <w:rFonts w:ascii="Times New Roman" w:hAnsi="Times New Roman" w:cs="Times New Roman"/>
+          <w:sz w:val="24"/>
+          <w:szCs w:val="24"/>
+          <w:lang w:val="en-US"/>
+        </w:rPr>
+        <w:t xml:space="preserve"> pada </w:t>
+      </w:r>
+      <w:r>
+        <w:rPr>
+          <w:rFonts w:ascii="Times New Roman" w:hAnsi="Times New Roman" w:cs="Times New Roman"/>
+          <w:i/>
+          <w:iCs/>
+          <w:sz w:val="24"/>
+          <w:szCs w:val="24"/>
+          <w:lang w:val="en-US"/>
+        </w:rPr>
         <w:t>time series</w:t>
       </w:r>
       <w:r>
@@ -5353,8 +5644,20 @@
           <w:szCs w:val="24"/>
           <w:lang w:val="en-US"/>
         </w:rPr>
-        <w:t xml:space="preserve"> untuk saham 5 saham</w:t>
-      </w:r>
+        <w:t xml:space="preserve"> </w:t>
+      </w:r>
+      <w:proofErr w:type="spellStart"/>
+      <w:proofErr w:type="gramStart"/>
+      <w:r>
+        <w:rPr>
+          <w:rFonts w:ascii="Times New Roman" w:hAnsi="Times New Roman" w:cs="Times New Roman"/>
+          <w:sz w:val="24"/>
+          <w:szCs w:val="24"/>
+          <w:lang w:val="en-US"/>
+        </w:rPr>
+        <w:t>saham</w:t>
+      </w:r>
+      <w:proofErr w:type="spellEnd"/>
       <w:r>
         <w:rPr>
           <w:rFonts w:ascii="Times New Roman" w:hAnsi="Times New Roman" w:cs="Times New Roman"/>
@@ -5364,6 +5667,7 @@
         </w:rPr>
         <w:t xml:space="preserve"> ?</w:t>
       </w:r>
+      <w:proofErr w:type="gramEnd"/>
     </w:p>
     <w:p>
       <w:pPr>
@@ -5408,14 +5712,94 @@
           <w:lang w:val="en-US"/>
         </w:rPr>
       </w:pPr>
-      <w:r>
-        <w:rPr>
-          <w:rFonts w:ascii="Times New Roman" w:hAnsi="Times New Roman" w:cs="Times New Roman"/>
-          <w:sz w:val="24"/>
-          <w:szCs w:val="24"/>
-          <w:lang w:val="en-US"/>
-        </w:rPr>
-        <w:t xml:space="preserve">Membandingkan tingkat akurasi prediksi harga penutupan saham antara model </w:t>
+      <w:proofErr w:type="spellStart"/>
+      <w:r>
+        <w:rPr>
+          <w:rFonts w:ascii="Times New Roman" w:hAnsi="Times New Roman" w:cs="Times New Roman"/>
+          <w:sz w:val="24"/>
+          <w:szCs w:val="24"/>
+          <w:lang w:val="en-US"/>
+        </w:rPr>
+        <w:t>Me</w:t>
+      </w:r>
+      <w:r>
+        <w:rPr>
+          <w:rFonts w:ascii="Times New Roman" w:hAnsi="Times New Roman" w:cs="Times New Roman"/>
+          <w:sz w:val="24"/>
+          <w:szCs w:val="24"/>
+          <w:lang w:val="en-US"/>
+        </w:rPr>
+        <w:t>nganalisis</w:t>
+      </w:r>
+      <w:proofErr w:type="spellEnd"/>
+      <w:r>
+        <w:rPr>
+          <w:rFonts w:ascii="Times New Roman" w:hAnsi="Times New Roman" w:cs="Times New Roman"/>
+          <w:sz w:val="24"/>
+          <w:szCs w:val="24"/>
+          <w:lang w:val="en-US"/>
+        </w:rPr>
+        <w:t xml:space="preserve"> </w:t>
+      </w:r>
+      <w:proofErr w:type="spellStart"/>
+      <w:r>
+        <w:rPr>
+          <w:rFonts w:ascii="Times New Roman" w:hAnsi="Times New Roman" w:cs="Times New Roman"/>
+          <w:sz w:val="24"/>
+          <w:szCs w:val="24"/>
+          <w:lang w:val="en-US"/>
+        </w:rPr>
+        <w:t>tingkat</w:t>
+      </w:r>
+      <w:proofErr w:type="spellEnd"/>
+      <w:r>
+        <w:rPr>
+          <w:rFonts w:ascii="Times New Roman" w:hAnsi="Times New Roman" w:cs="Times New Roman"/>
+          <w:sz w:val="24"/>
+          <w:szCs w:val="24"/>
+          <w:lang w:val="en-US"/>
+        </w:rPr>
+        <w:t xml:space="preserve"> </w:t>
+      </w:r>
+      <w:proofErr w:type="spellStart"/>
+      <w:r>
+        <w:rPr>
+          <w:rFonts w:ascii="Times New Roman" w:hAnsi="Times New Roman" w:cs="Times New Roman"/>
+          <w:sz w:val="24"/>
+          <w:szCs w:val="24"/>
+          <w:lang w:val="en-US"/>
+        </w:rPr>
+        <w:t>akurasi</w:t>
+      </w:r>
+      <w:proofErr w:type="spellEnd"/>
+      <w:r>
+        <w:rPr>
+          <w:rFonts w:ascii="Times New Roman" w:hAnsi="Times New Roman" w:cs="Times New Roman"/>
+          <w:sz w:val="24"/>
+          <w:szCs w:val="24"/>
+          <w:lang w:val="en-US"/>
+        </w:rPr>
+        <w:t xml:space="preserve"> </w:t>
+      </w:r>
+      <w:proofErr w:type="spellStart"/>
+      <w:r>
+        <w:rPr>
+          <w:rFonts w:ascii="Times New Roman" w:hAnsi="Times New Roman" w:cs="Times New Roman"/>
+          <w:sz w:val="24"/>
+          <w:szCs w:val="24"/>
+          <w:lang w:val="en-US"/>
+        </w:rPr>
+        <w:t>prediksi</w:t>
+      </w:r>
+      <w:proofErr w:type="spellEnd"/>
+      <w:r>
+        <w:rPr>
+          <w:rFonts w:ascii="Times New Roman" w:hAnsi="Times New Roman" w:cs="Times New Roman"/>
+          <w:sz w:val="24"/>
+          <w:szCs w:val="24"/>
+          <w:lang w:val="en-US"/>
+        </w:rPr>
+        <w:t xml:space="preserve"> harga penutupan saham antara model </w:t>
       </w:r>
       <w:r>
         <w:rPr>
@@ -5475,6 +5859,7 @@
         </w:rPr>
         <w:t xml:space="preserve">lima </w:t>
       </w:r>
+      <w:proofErr w:type="spellStart"/>
       <w:r>
         <w:rPr>
           <w:rFonts w:ascii="Times New Roman" w:hAnsi="Times New Roman" w:cs="Times New Roman"/>
@@ -5484,14 +5869,35 @@
         </w:rPr>
         <w:t>saham</w:t>
       </w:r>
-      <w:r>
-        <w:rPr>
-          <w:rFonts w:ascii="Times New Roman" w:hAnsi="Times New Roman" w:cs="Times New Roman"/>
-          <w:sz w:val="24"/>
-          <w:szCs w:val="24"/>
-          <w:lang w:val="en-US"/>
-        </w:rPr>
-        <w:t xml:space="preserve"> perbankan yang diteliti.</w:t>
+      <w:proofErr w:type="spellEnd"/>
+      <w:r>
+        <w:rPr>
+          <w:rFonts w:ascii="Times New Roman" w:hAnsi="Times New Roman" w:cs="Times New Roman"/>
+          <w:sz w:val="24"/>
+          <w:szCs w:val="24"/>
+          <w:lang w:val="en-US"/>
+        </w:rPr>
+        <w:t xml:space="preserve"> </w:t>
+      </w:r>
+      <w:proofErr w:type="spellStart"/>
+      <w:r>
+        <w:rPr>
+          <w:rFonts w:ascii="Times New Roman" w:hAnsi="Times New Roman" w:cs="Times New Roman"/>
+          <w:sz w:val="24"/>
+          <w:szCs w:val="24"/>
+          <w:lang w:val="en-US"/>
+        </w:rPr>
+        <w:t>perbankan</w:t>
+      </w:r>
+      <w:proofErr w:type="spellEnd"/>
+      <w:r>
+        <w:rPr>
+          <w:rFonts w:ascii="Times New Roman" w:hAnsi="Times New Roman" w:cs="Times New Roman"/>
+          <w:sz w:val="24"/>
+          <w:szCs w:val="24"/>
+          <w:lang w:val="en-US"/>
+        </w:rPr>
+        <w:t>.</w:t>
       </w:r>
     </w:p>
     <w:p>
@@ -5510,14 +5916,74 @@
           <w:lang w:val="en-US"/>
         </w:rPr>
       </w:pPr>
-      <w:r>
-        <w:rPr>
-          <w:rFonts w:ascii="Times New Roman" w:hAnsi="Times New Roman" w:cs="Times New Roman"/>
-          <w:sz w:val="24"/>
-          <w:szCs w:val="24"/>
-          <w:lang w:val="en-US"/>
-        </w:rPr>
-        <w:t xml:space="preserve">Menentukan model Deep Learning (LSTM atau GRU) yang paling optimal dalam memprediksi data </w:t>
+      <w:proofErr w:type="spellStart"/>
+      <w:r>
+        <w:rPr>
+          <w:rFonts w:ascii="Times New Roman" w:hAnsi="Times New Roman" w:cs="Times New Roman"/>
+          <w:sz w:val="24"/>
+          <w:szCs w:val="24"/>
+          <w:lang w:val="en-US"/>
+        </w:rPr>
+        <w:t>Men</w:t>
+      </w:r>
+      <w:r>
+        <w:rPr>
+          <w:rFonts w:ascii="Times New Roman" w:hAnsi="Times New Roman" w:cs="Times New Roman"/>
+          <w:sz w:val="24"/>
+          <w:szCs w:val="24"/>
+          <w:lang w:val="en-US"/>
+        </w:rPr>
+        <w:t>gidentifikasi</w:t>
+      </w:r>
+      <w:proofErr w:type="spellEnd"/>
+      <w:r>
+        <w:rPr>
+          <w:rFonts w:ascii="Times New Roman" w:hAnsi="Times New Roman" w:cs="Times New Roman"/>
+          <w:sz w:val="24"/>
+          <w:szCs w:val="24"/>
+          <w:lang w:val="en-US"/>
+        </w:rPr>
+        <w:t xml:space="preserve"> </w:t>
+      </w:r>
+      <w:proofErr w:type="spellStart"/>
+      <w:r>
+        <w:rPr>
+          <w:rFonts w:ascii="Times New Roman" w:hAnsi="Times New Roman" w:cs="Times New Roman"/>
+          <w:sz w:val="24"/>
+          <w:szCs w:val="24"/>
+          <w:lang w:val="en-US"/>
+        </w:rPr>
+        <w:t>karakteristik</w:t>
+      </w:r>
+      <w:proofErr w:type="spellEnd"/>
+      <w:r>
+        <w:rPr>
+          <w:rFonts w:ascii="Times New Roman" w:hAnsi="Times New Roman" w:cs="Times New Roman"/>
+          <w:sz w:val="24"/>
+          <w:szCs w:val="24"/>
+          <w:lang w:val="en-US"/>
+        </w:rPr>
+        <w:t xml:space="preserve"> </w:t>
+      </w:r>
+      <w:proofErr w:type="spellStart"/>
+      <w:r>
+        <w:rPr>
+          <w:rFonts w:ascii="Times New Roman" w:hAnsi="Times New Roman" w:cs="Times New Roman"/>
+          <w:sz w:val="24"/>
+          <w:szCs w:val="24"/>
+          <w:lang w:val="en-US"/>
+        </w:rPr>
+        <w:t>kinerja</w:t>
+      </w:r>
+      <w:proofErr w:type="spellEnd"/>
+      <w:r>
+        <w:rPr>
+          <w:rFonts w:ascii="Times New Roman" w:hAnsi="Times New Roman" w:cs="Times New Roman"/>
+          <w:sz w:val="24"/>
+          <w:szCs w:val="24"/>
+          <w:lang w:val="en-US"/>
+        </w:rPr>
+        <w:t xml:space="preserve"> model </w:t>
       </w:r>
       <w:r>
         <w:rPr>
@@ -5528,7 +5994,125 @@
           <w:szCs w:val="24"/>
           <w:lang w:val="en-US"/>
         </w:rPr>
-        <w:t>time series</w:t>
+        <w:t>deep learning</w:t>
+      </w:r>
+      <w:r>
+        <w:rPr>
+          <w:rFonts w:ascii="Times New Roman" w:hAnsi="Times New Roman" w:cs="Times New Roman"/>
+          <w:sz w:val="24"/>
+          <w:szCs w:val="24"/>
+          <w:lang w:val="en-US"/>
+        </w:rPr>
+        <w:t xml:space="preserve"> </w:t>
+      </w:r>
+      <w:r>
+        <w:rPr>
+          <w:rFonts w:ascii="Times New Roman" w:hAnsi="Times New Roman" w:cs="Times New Roman"/>
+          <w:sz w:val="24"/>
+          <w:szCs w:val="24"/>
+          <w:lang w:val="en-US"/>
+        </w:rPr>
+        <w:t xml:space="preserve">dalam </w:t>
+      </w:r>
+      <w:proofErr w:type="spellStart"/>
+      <w:r>
+        <w:rPr>
+          <w:rFonts w:ascii="Times New Roman" w:hAnsi="Times New Roman" w:cs="Times New Roman"/>
+          <w:sz w:val="24"/>
+          <w:szCs w:val="24"/>
+          <w:lang w:val="en-US"/>
+        </w:rPr>
+        <w:t>menghasilkan</w:t>
+      </w:r>
+      <w:proofErr w:type="spellEnd"/>
+      <w:r>
+        <w:rPr>
+          <w:rFonts w:ascii="Times New Roman" w:hAnsi="Times New Roman" w:cs="Times New Roman"/>
+          <w:sz w:val="24"/>
+          <w:szCs w:val="24"/>
+          <w:lang w:val="en-US"/>
+        </w:rPr>
+        <w:t xml:space="preserve"> </w:t>
+      </w:r>
+      <w:proofErr w:type="spellStart"/>
+      <w:r>
+        <w:rPr>
+          <w:rFonts w:ascii="Times New Roman" w:hAnsi="Times New Roman" w:cs="Times New Roman"/>
+          <w:sz w:val="24"/>
+          <w:szCs w:val="24"/>
+          <w:lang w:val="en-US"/>
+        </w:rPr>
+        <w:t>prediksi</w:t>
+      </w:r>
+      <w:proofErr w:type="spellEnd"/>
+      <w:r>
+        <w:rPr>
+          <w:rFonts w:ascii="Times New Roman" w:hAnsi="Times New Roman" w:cs="Times New Roman"/>
+          <w:sz w:val="24"/>
+          <w:szCs w:val="24"/>
+          <w:lang w:val="en-US"/>
+        </w:rPr>
+        <w:t xml:space="preserve"> yang </w:t>
+      </w:r>
+      <w:proofErr w:type="spellStart"/>
+      <w:r>
+        <w:rPr>
+          <w:rFonts w:ascii="Times New Roman" w:hAnsi="Times New Roman" w:cs="Times New Roman"/>
+          <w:sz w:val="24"/>
+          <w:szCs w:val="24"/>
+          <w:lang w:val="en-US"/>
+        </w:rPr>
+        <w:t>stabil</w:t>
+      </w:r>
+      <w:proofErr w:type="spellEnd"/>
+      <w:r>
+        <w:rPr>
+          <w:rFonts w:ascii="Times New Roman" w:hAnsi="Times New Roman" w:cs="Times New Roman"/>
+          <w:sz w:val="24"/>
+          <w:szCs w:val="24"/>
+          <w:lang w:val="en-US"/>
+        </w:rPr>
+        <w:t xml:space="preserve">, </w:t>
+      </w:r>
+      <w:proofErr w:type="spellStart"/>
+      <w:r>
+        <w:rPr>
+          <w:rFonts w:ascii="Times New Roman" w:hAnsi="Times New Roman" w:cs="Times New Roman"/>
+          <w:sz w:val="24"/>
+          <w:szCs w:val="24"/>
+          <w:lang w:val="en-US"/>
+        </w:rPr>
+        <w:t>konsisten</w:t>
+      </w:r>
+      <w:proofErr w:type="spellEnd"/>
+      <w:r>
+        <w:rPr>
+          <w:rFonts w:ascii="Times New Roman" w:hAnsi="Times New Roman" w:cs="Times New Roman"/>
+          <w:sz w:val="24"/>
+          <w:szCs w:val="24"/>
+          <w:lang w:val="en-US"/>
+        </w:rPr>
+        <w:t xml:space="preserve">, dan </w:t>
+      </w:r>
+      <w:proofErr w:type="spellStart"/>
+      <w:r>
+        <w:rPr>
+          <w:rFonts w:ascii="Times New Roman" w:hAnsi="Times New Roman" w:cs="Times New Roman"/>
+          <w:sz w:val="24"/>
+          <w:szCs w:val="24"/>
+          <w:lang w:val="en-US"/>
+        </w:rPr>
+        <w:t>efisien</w:t>
+      </w:r>
+      <w:proofErr w:type="spellEnd"/>
+      <w:r>
+        <w:rPr>
+          <w:rFonts w:ascii="Times New Roman" w:hAnsi="Times New Roman" w:cs="Times New Roman"/>
+          <w:sz w:val="24"/>
+          <w:szCs w:val="24"/>
+          <w:lang w:val="en-US"/>
+        </w:rPr>
+        <w:t xml:space="preserve"> pada data </w:t>
       </w:r>
       <w:r>
         <w:rPr>
@@ -5539,17 +6123,28 @@
           <w:szCs w:val="24"/>
           <w:lang w:val="en-US"/>
         </w:rPr>
-        <w:t xml:space="preserve"> </w:t>
-      </w:r>
-      <w:r>
-        <w:rPr>
-          <w:rFonts w:ascii="Times New Roman" w:hAnsi="Times New Roman" w:cs="Times New Roman"/>
-          <w:sz w:val="24"/>
-          <w:szCs w:val="24"/>
-          <w:lang w:val="en-US"/>
-        </w:rPr>
-        <w:t>pada 5 saham</w:t>
-      </w:r>
+        <w:t>time series</w:t>
+      </w:r>
+      <w:r>
+        <w:rPr>
+          <w:rFonts w:ascii="Times New Roman" w:hAnsi="Times New Roman" w:cs="Times New Roman"/>
+          <w:sz w:val="24"/>
+          <w:szCs w:val="24"/>
+          <w:lang w:val="en-US"/>
+        </w:rPr>
+        <w:t xml:space="preserve"> </w:t>
+      </w:r>
+      <w:proofErr w:type="spellStart"/>
+      <w:r>
+        <w:rPr>
+          <w:rFonts w:ascii="Times New Roman" w:hAnsi="Times New Roman" w:cs="Times New Roman"/>
+          <w:sz w:val="24"/>
+          <w:szCs w:val="24"/>
+          <w:lang w:val="en-US"/>
+        </w:rPr>
+        <w:t>saham</w:t>
+      </w:r>
+      <w:proofErr w:type="spellEnd"/>
       <w:r>
         <w:rPr>
           <w:rFonts w:ascii="Times New Roman" w:hAnsi="Times New Roman" w:cs="Times New Roman"/>
@@ -9060,27 +9655,7 @@
           <w:szCs w:val="24"/>
           <w:lang w:val="en-US"/>
         </w:rPr>
-        <w:t xml:space="preserve"> model. </w:t>
-      </w:r>
-      <w:proofErr w:type="spellStart"/>
-      <w:r>
-        <w:rPr>
-          <w:rFonts w:ascii="Times New Roman" w:hAnsi="Times New Roman" w:cs="Times New Roman"/>
-          <w:sz w:val="24"/>
-          <w:szCs w:val="24"/>
-          <w:lang w:val="en-US"/>
-        </w:rPr>
-        <w:t>Studi</w:t>
-      </w:r>
-      <w:proofErr w:type="spellEnd"/>
-      <w:r>
-        <w:rPr>
-          <w:rFonts w:ascii="Times New Roman" w:hAnsi="Times New Roman" w:cs="Times New Roman"/>
-          <w:sz w:val="24"/>
-          <w:szCs w:val="24"/>
-          <w:lang w:val="en-US"/>
-        </w:rPr>
-        <w:t xml:space="preserve"> tersebut </w:t>
+        <w:t xml:space="preserve"> model. Studi tersebut </w:t>
       </w:r>
       <w:proofErr w:type="spellStart"/>
       <w:r>
@@ -12597,27 +13172,7 @@
           <w:szCs w:val="24"/>
           <w:lang w:val="en-US"/>
         </w:rPr>
-        <w:t xml:space="preserve"> waktu. </w:t>
-      </w:r>
-      <w:proofErr w:type="spellStart"/>
-      <w:r>
-        <w:rPr>
-          <w:rFonts w:ascii="Times New Roman" w:hAnsi="Times New Roman" w:cs="Times New Roman"/>
-          <w:sz w:val="24"/>
-          <w:szCs w:val="24"/>
-          <w:lang w:val="en-US"/>
-        </w:rPr>
-        <w:t>Studi</w:t>
-      </w:r>
-      <w:proofErr w:type="spellEnd"/>
-      <w:r>
-        <w:rPr>
-          <w:rFonts w:ascii="Times New Roman" w:hAnsi="Times New Roman" w:cs="Times New Roman"/>
-          <w:sz w:val="24"/>
-          <w:szCs w:val="24"/>
-          <w:lang w:val="en-US"/>
-        </w:rPr>
-        <w:t xml:space="preserve"> tersebut melakukan </w:t>
+        <w:t xml:space="preserve"> waktu. Studi tersebut melakukan </w:t>
       </w:r>
       <w:proofErr w:type="spellStart"/>
       <w:r>
@@ -20266,27 +20821,7 @@
           <w:szCs w:val="24"/>
           <w:lang w:val="en-US"/>
         </w:rPr>
-        <w:t xml:space="preserve">. </w:t>
-      </w:r>
-      <w:proofErr w:type="spellStart"/>
-      <w:r>
-        <w:rPr>
-          <w:rFonts w:ascii="Times New Roman" w:hAnsi="Times New Roman" w:cs="Times New Roman"/>
-          <w:sz w:val="24"/>
-          <w:szCs w:val="24"/>
-          <w:lang w:val="en-US"/>
-        </w:rPr>
-        <w:t>Studi</w:t>
-      </w:r>
-      <w:proofErr w:type="spellEnd"/>
-      <w:r>
-        <w:rPr>
-          <w:rFonts w:ascii="Times New Roman" w:hAnsi="Times New Roman" w:cs="Times New Roman"/>
-          <w:sz w:val="24"/>
-          <w:szCs w:val="24"/>
-          <w:lang w:val="en-US"/>
-        </w:rPr>
-        <w:t xml:space="preserve"> </w:t>
+        <w:t xml:space="preserve">. Studi </w:t>
       </w:r>
       <w:proofErr w:type="spellStart"/>
       <w:r>
@@ -22875,27 +23410,7 @@
           <w:szCs w:val="24"/>
           <w:lang w:val="en-US"/>
         </w:rPr>
-        <w:t xml:space="preserve"> deep learning—RNN, LSTM, dan GRU. </w:t>
-      </w:r>
-      <w:proofErr w:type="spellStart"/>
-      <w:r>
-        <w:rPr>
-          <w:rFonts w:ascii="Times New Roman" w:hAnsi="Times New Roman" w:cs="Times New Roman"/>
-          <w:sz w:val="24"/>
-          <w:szCs w:val="24"/>
-          <w:lang w:val="en-US"/>
-        </w:rPr>
-        <w:t>Studi</w:t>
-      </w:r>
-      <w:proofErr w:type="spellEnd"/>
-      <w:r>
-        <w:rPr>
-          <w:rFonts w:ascii="Times New Roman" w:hAnsi="Times New Roman" w:cs="Times New Roman"/>
-          <w:sz w:val="24"/>
-          <w:szCs w:val="24"/>
-          <w:lang w:val="en-US"/>
-        </w:rPr>
-        <w:t xml:space="preserve"> </w:t>
+        <w:t xml:space="preserve"> deep learning—RNN, LSTM, dan GRU. Studi </w:t>
       </w:r>
       <w:proofErr w:type="spellStart"/>
       <w:r>
@@ -32998,9 +33513,78 @@
           <w:szCs w:val="24"/>
           <w:lang w:val="en-US"/>
         </w:rPr>
-        <w:t xml:space="preserve"> adalah nilai prediksi dari variabel ak</w:t>
-      </w:r>
-      <w:proofErr w:type="spellStart"/>
+        <w:t xml:space="preserve"> adalah nilai </w:t>
+      </w:r>
+      <w:proofErr w:type="spellStart"/>
+      <w:r>
+        <w:rPr>
+          <w:rFonts w:ascii="Times New Roman" w:hAnsi="Times New Roman" w:cs="Times New Roman"/>
+          <w:sz w:val="24"/>
+          <w:szCs w:val="24"/>
+          <w:lang w:val="en-US"/>
+        </w:rPr>
+        <w:t>prediksi</w:t>
+      </w:r>
+      <w:proofErr w:type="spellEnd"/>
+      <w:r>
+        <w:rPr>
+          <w:rFonts w:ascii="Times New Roman" w:hAnsi="Times New Roman" w:cs="Times New Roman"/>
+          <w:sz w:val="24"/>
+          <w:szCs w:val="24"/>
+          <w:lang w:val="en-US"/>
+        </w:rPr>
+        <w:t xml:space="preserve"> </w:t>
+      </w:r>
+      <w:proofErr w:type="spellStart"/>
+      <w:r>
+        <w:rPr>
+          <w:rFonts w:ascii="Times New Roman" w:hAnsi="Times New Roman" w:cs="Times New Roman"/>
+          <w:sz w:val="24"/>
+          <w:szCs w:val="24"/>
+          <w:lang w:val="en-US"/>
+        </w:rPr>
+        <w:t>dari</w:t>
+      </w:r>
+      <w:proofErr w:type="spellEnd"/>
+      <w:r>
+        <w:rPr>
+          <w:rFonts w:ascii="Times New Roman" w:hAnsi="Times New Roman" w:cs="Times New Roman"/>
+          <w:sz w:val="24"/>
+          <w:szCs w:val="24"/>
+          <w:lang w:val="en-US"/>
+        </w:rPr>
+        <w:t xml:space="preserve"> </w:t>
+      </w:r>
+      <w:proofErr w:type="spellStart"/>
+      <w:r>
+        <w:rPr>
+          <w:rFonts w:ascii="Times New Roman" w:hAnsi="Times New Roman" w:cs="Times New Roman"/>
+          <w:sz w:val="24"/>
+          <w:szCs w:val="24"/>
+          <w:lang w:val="en-US"/>
+        </w:rPr>
+        <w:t>variabel</w:t>
+      </w:r>
+      <w:proofErr w:type="spellEnd"/>
+      <w:r>
+        <w:rPr>
+          <w:rFonts w:ascii="Times New Roman" w:hAnsi="Times New Roman" w:cs="Times New Roman"/>
+          <w:sz w:val="24"/>
+          <w:szCs w:val="24"/>
+          <w:lang w:val="en-US"/>
+        </w:rPr>
+        <w:t xml:space="preserve"> </w:t>
+      </w:r>
+      <w:proofErr w:type="spellStart"/>
+      <w:r>
+        <w:rPr>
+          <w:rFonts w:ascii="Times New Roman" w:hAnsi="Times New Roman" w:cs="Times New Roman"/>
+          <w:sz w:val="24"/>
+          <w:szCs w:val="24"/>
+          <w:lang w:val="en-US"/>
+        </w:rPr>
+        <w:t>ak</w:t>
+      </w:r>
       <w:r>
         <w:rPr>
           <w:rFonts w:ascii="Times New Roman" w:hAnsi="Times New Roman" w:cs="Times New Roman"/>

</xml_diff>